<commit_message>
Created Milestone 4 Part 2 Team Assignments & Standards Documents.
</commit_message>
<xml_diff>
--- a/01_Standards/Milestone_4_Interfaces_and_Data_Structures/M4_Class_Diagram_QA_Checklist.docx
+++ b/01_Standards/Milestone_4_Interfaces_and_Data_Structures/M4_Class_Diagram_QA_Checklist.docx
@@ -218,35 +218,7 @@
         <w:rPr>
           <w:rFonts w:ascii="Arial" w:hAnsi="Arial"/>
         </w:rPr>
-        <w:t xml:space="preserve">Font is </w:t>
-      </w:r>
-      <w:proofErr w:type="gramStart"/>
-      <w:r>
-        <w:rPr>
-          <w:rFonts w:ascii="Arial" w:hAnsi="Arial"/>
-        </w:rPr>
-        <w:t>Arial  12</w:t>
-      </w:r>
-      <w:proofErr w:type="gramEnd"/>
-      <w:r>
-        <w:rPr>
-          <w:rFonts w:ascii="Arial" w:hAnsi="Arial"/>
-        </w:rPr>
-        <w:t xml:space="preserve"> </w:t>
-      </w:r>
-      <w:proofErr w:type="spellStart"/>
-      <w:r>
-        <w:rPr>
-          <w:rFonts w:ascii="Arial" w:hAnsi="Arial"/>
-        </w:rPr>
-        <w:t>px</w:t>
-      </w:r>
-      <w:proofErr w:type="spellEnd"/>
-      <w:r>
-        <w:rPr>
-          <w:rFonts w:ascii="Arial" w:hAnsi="Arial"/>
-        </w:rPr>
-        <w:t xml:space="preserve"> Bold throughout all class boxes</w:t>
+        <w:t>Font is Arial  12 px Bold throughout all class boxes</w:t>
       </w:r>
     </w:p>
     <w:p>
@@ -357,7 +329,31 @@
         <w:rPr>
           <w:rFonts w:ascii="Arial" w:hAnsi="Arial"/>
         </w:rPr>
-        <w:t xml:space="preserve">Each diagram has a heading: "&lt;Class Name&gt; Class Diagram" formatted Arial Bold </w:t>
+        <w:t>Each diagram has a heading: "</w:t>
+      </w:r>
+      <w:r>
+        <w:rPr>
+          <w:rFonts w:ascii="Arial" w:hAnsi="Arial"/>
+        </w:rPr>
+        <w:t>&lt;Subcomponent Number&gt;</w:t>
+      </w:r>
+      <w:r>
+        <w:rPr>
+          <w:rFonts w:ascii="Arial" w:hAnsi="Arial"/>
+        </w:rPr>
+        <w:t>-</w:t>
+      </w:r>
+      <w:r>
+        <w:rPr>
+          <w:rFonts w:ascii="Arial" w:hAnsi="Arial"/>
+        </w:rPr>
+        <w:t>CD &lt;Primary Class Name&gt;</w:t>
+      </w:r>
+      <w:r>
+        <w:rPr>
+          <w:rFonts w:ascii="Arial" w:hAnsi="Arial"/>
+        </w:rPr>
+        <w:t xml:space="preserve"> Class Diagram" formatted Arial Bold </w:t>
       </w:r>
       <w:r>
         <w:rPr>

</xml_diff>

<commit_message>
Updated the Class Diagram QA Heading
</commit_message>
<xml_diff>
--- a/01_Standards/Milestone_4_Interfaces_and_Data_Structures/M4_Class_Diagram_QA_Checklist.docx
+++ b/01_Standards/Milestone_4_Interfaces_and_Data_Structures/M4_Class_Diagram_QA_Checklist.docx
@@ -359,13 +359,19 @@
         <w:rPr>
           <w:rFonts w:ascii="Arial" w:hAnsi="Arial"/>
         </w:rPr>
-        <w:t>13.5</w:t>
+        <w:t>1</w:t>
       </w:r>
       <w:r>
         <w:rPr>
           <w:rFonts w:ascii="Arial" w:hAnsi="Arial"/>
         </w:rPr>
-        <w:t xml:space="preserve"> pt</w:t>
+        <w:t>2</w:t>
+      </w:r>
+      <w:r>
+        <w:rPr>
+          <w:rFonts w:ascii="Arial" w:hAnsi="Arial"/>
+        </w:rPr>
+        <w:t>pt</w:t>
       </w:r>
     </w:p>
     <w:p>

</xml_diff>